<commit_message>
Push ALL JAVA ET AUTRES
</commit_message>
<xml_diff>
--- a/S2/R2.10B - Comptabilité/TD1/TD1.docx
+++ b/S2/R2.10B - Comptabilité/TD1/TD1.docx
@@ -14,15 +14,19 @@
           <w:b/>
           <w:bCs/>
         </w:rPr>
-        <w:t>Exercice 1 – Calcul de la TVA due sur des ventes et achats</w:t>
+        <w:t xml:space="preserve">Exercice 1 – Calcul de la TVA due sur des ventes et achats </w:t>
       </w:r>
     </w:p>
     <w:p>
       <w:pPr>
         <w:numPr>
           <w:ilvl w:val="0"/>
-          <w:numId w:val="1"/>
-        </w:numPr>
+          <w:numId w:val="11"/>
+        </w:numPr>
+        <w:rPr>
+          <w:b/>
+          <w:bCs/>
+        </w:rPr>
       </w:pPr>
       <w:r>
         <w:rPr>
@@ -34,57 +38,62 @@
     </w:p>
     <w:p>
       <w:pPr>
-        <w:numPr>
-          <w:ilvl w:val="1"/>
-          <w:numId w:val="1"/>
-        </w:numPr>
-      </w:pPr>
-      <w:r>
-        <w:t>Matériel informatique : 15000×0.2=300015 000 \times 0.2 = 3 00015000×0.2=3000 €</w:t>
-      </w:r>
-    </w:p>
-    <w:p>
-      <w:pPr>
-        <w:numPr>
-          <w:ilvl w:val="1"/>
-          <w:numId w:val="1"/>
-        </w:numPr>
-      </w:pPr>
-      <w:r>
-        <w:t>Services de maintenance : 5000×0.2=10005 000 \times 0.2 = 1 0005000×0.2=1000 €</w:t>
-      </w:r>
-    </w:p>
-    <w:p>
-      <w:pPr>
-        <w:numPr>
-          <w:ilvl w:val="1"/>
-          <w:numId w:val="1"/>
-        </w:numPr>
-      </w:pPr>
-      <w:r>
-        <w:rPr>
-          <w:b/>
-          <w:bCs/>
-        </w:rPr>
-        <w:t>Total TVA collectée</w:t>
-      </w:r>
-      <w:r>
-        <w:t xml:space="preserve"> : </w:t>
-      </w:r>
-      <w:r>
-        <w:rPr>
-          <w:b/>
-          <w:bCs/>
-        </w:rPr>
-        <w:t>4 000 €</w:t>
+        <w:ind w:firstLine="708"/>
+        <w:rPr>
+          <w:b/>
+          <w:bCs/>
+        </w:rPr>
+      </w:pPr>
+      <w:r>
+        <w:rPr>
+          <w:b/>
+          <w:bCs/>
+        </w:rPr>
+        <w:t>o Matériel informatique : 15000 *1.2 – 15000 = 3000 €</w:t>
+      </w:r>
+    </w:p>
+    <w:p>
+      <w:pPr>
+        <w:ind w:firstLine="708"/>
+        <w:rPr>
+          <w:b/>
+          <w:bCs/>
+        </w:rPr>
+      </w:pPr>
+      <w:r>
+        <w:rPr>
+          <w:b/>
+          <w:bCs/>
+        </w:rPr>
+        <w:t xml:space="preserve">o Services de maintenance : 5000×1.2 - 5000 = 1000 € </w:t>
+      </w:r>
+    </w:p>
+    <w:p>
+      <w:pPr>
+        <w:ind w:firstLine="708"/>
+        <w:rPr>
+          <w:b/>
+          <w:bCs/>
+        </w:rPr>
+      </w:pPr>
+      <w:r>
+        <w:rPr>
+          <w:b/>
+          <w:bCs/>
+        </w:rPr>
+        <w:t xml:space="preserve">o Total TVA collectée : 4 000 € </w:t>
       </w:r>
     </w:p>
     <w:p>
       <w:pPr>
         <w:numPr>
           <w:ilvl w:val="0"/>
-          <w:numId w:val="1"/>
-        </w:numPr>
+          <w:numId w:val="12"/>
+        </w:numPr>
+        <w:rPr>
+          <w:b/>
+          <w:bCs/>
+        </w:rPr>
       </w:pPr>
       <w:r>
         <w:rPr>
@@ -96,57 +105,76 @@
     </w:p>
     <w:p>
       <w:pPr>
-        <w:numPr>
-          <w:ilvl w:val="1"/>
-          <w:numId w:val="1"/>
-        </w:numPr>
-      </w:pPr>
-      <w:r>
-        <w:t>Fournitures de bureau : 2500×0.2=5002 500 \times 0.2 = 5002500×0.2=500 €</w:t>
-      </w:r>
-    </w:p>
-    <w:p>
-      <w:pPr>
-        <w:numPr>
-          <w:ilvl w:val="1"/>
-          <w:numId w:val="1"/>
-        </w:numPr>
-      </w:pPr>
-      <w:r>
-        <w:t>Logiciels : 3000×0.2=6003 000 \times 0.2 = 6003000×0.2=600 €</w:t>
-      </w:r>
-    </w:p>
-    <w:p>
-      <w:pPr>
-        <w:numPr>
-          <w:ilvl w:val="1"/>
-          <w:numId w:val="1"/>
-        </w:numPr>
-      </w:pPr>
-      <w:r>
-        <w:rPr>
-          <w:b/>
-          <w:bCs/>
-        </w:rPr>
-        <w:t>Total TVA déductible</w:t>
-      </w:r>
-      <w:r>
-        <w:t xml:space="preserve"> : </w:t>
-      </w:r>
-      <w:r>
-        <w:rPr>
-          <w:b/>
-          <w:bCs/>
-        </w:rPr>
-        <w:t>1 100 €</w:t>
+        <w:ind w:firstLine="708"/>
+        <w:rPr>
+          <w:b/>
+          <w:bCs/>
+        </w:rPr>
+      </w:pPr>
+      <w:r>
+        <w:rPr>
+          <w:b/>
+          <w:bCs/>
+        </w:rPr>
+        <w:t>o Fournitures de bureau : 2500×1.2 – 2500 = 500 €</w:t>
+      </w:r>
+    </w:p>
+    <w:p>
+      <w:pPr>
+        <w:ind w:firstLine="360"/>
+        <w:rPr>
+          <w:b/>
+          <w:bCs/>
+        </w:rPr>
+      </w:pPr>
+      <w:r>
+        <w:rPr>
+          <w:b/>
+          <w:bCs/>
+        </w:rPr>
+        <w:t xml:space="preserve"> </w:t>
+      </w:r>
+      <w:r>
+        <w:rPr>
+          <w:b/>
+          <w:bCs/>
+        </w:rPr>
+        <w:tab/>
+      </w:r>
+      <w:r>
+        <w:rPr>
+          <w:b/>
+          <w:bCs/>
+        </w:rPr>
+        <w:t xml:space="preserve">o Logiciels : 3000×1.2 - 3000 = 600 € </w:t>
+      </w:r>
+    </w:p>
+    <w:p>
+      <w:pPr>
+        <w:ind w:firstLine="360"/>
+        <w:rPr>
+          <w:b/>
+          <w:bCs/>
+        </w:rPr>
+      </w:pPr>
+      <w:r>
+        <w:rPr>
+          <w:b/>
+          <w:bCs/>
+        </w:rPr>
+        <w:t xml:space="preserve">o Total TVA déductible : 1 100 € </w:t>
       </w:r>
     </w:p>
     <w:p>
       <w:pPr>
         <w:numPr>
           <w:ilvl w:val="0"/>
-          <w:numId w:val="1"/>
-        </w:numPr>
+          <w:numId w:val="13"/>
+        </w:numPr>
+        <w:rPr>
+          <w:b/>
+          <w:bCs/>
+        </w:rPr>
       </w:pPr>
       <w:r>
         <w:rPr>
@@ -158,19 +186,18 @@
     </w:p>
     <w:p>
       <w:pPr>
-        <w:numPr>
-          <w:ilvl w:val="1"/>
-          <w:numId w:val="1"/>
-        </w:numPr>
-      </w:pPr>
-      <w:r>
-        <w:t>4000−1100=29004 000 - 1 100 = 2 9004000−1100=2900 €</w:t>
-      </w:r>
-    </w:p>
-    <w:p>
+        <w:ind w:firstLine="708"/>
+      </w:pPr>
+      <w:r>
+        <w:rPr>
+          <w:b/>
+          <w:bCs/>
+        </w:rPr>
+        <w:t>o 4000−1100=2900 €</w:t>
+      </w:r>
       <w:r>
         <w:pict w14:anchorId="78C15FE6">
-          <v:rect id="_x0000_i1079" style="width:0;height:1.5pt" o:hralign="center" o:hrstd="t" o:hr="t" fillcolor="#a0a0a0" stroked="f"/>
+          <v:rect id="_x0000_i1025" style="width:0;height:1.5pt" o:hralign="center" o:hrstd="t" o:hr="t" fillcolor="#a0a0a0" stroked="f"/>
         </w:pict>
       </w:r>
     </w:p>
@@ -352,7 +379,6 @@
           <w:b/>
           <w:bCs/>
         </w:rPr>
-        <w:lastRenderedPageBreak/>
         <w:t>Exercice 3 – Calcul de la TVA due avec des opérations spécifiques</w:t>
       </w:r>
     </w:p>
@@ -379,6 +405,7 @@
         </w:numPr>
       </w:pPr>
       <w:r>
+        <w:lastRenderedPageBreak/>
         <w:t>Services informatiques : 10000×0.2=200010 000 \times 0.2 = 2 00010000×0.2=2000 €</w:t>
       </w:r>
     </w:p>
@@ -509,7 +536,7 @@
     <w:p>
       <w:r>
         <w:pict w14:anchorId="7CB7E2D2">
-          <v:rect id="_x0000_i1081" style="width:0;height:1.5pt" o:hralign="center" o:hrstd="t" o:hr="t" fillcolor="#a0a0a0" stroked="f"/>
+          <v:rect id="_x0000_i1026" style="width:0;height:1.5pt" o:hralign="center" o:hrstd="t" o:hr="t" fillcolor="#a0a0a0" stroked="f"/>
         </w:pict>
       </w:r>
     </w:p>
@@ -551,15 +578,7 @@
         </w:numPr>
       </w:pPr>
       <w:r>
-        <w:t>(5×</w:t>
-      </w:r>
-      <w:proofErr w:type="gramStart"/>
-      <w:r>
-        <w:t>800)+(</w:t>
-      </w:r>
-      <w:proofErr w:type="gramEnd"/>
-      <w:r>
-        <w:t>10×20)+50=4000+200+50=4250(5 \times 800) + (10 \times 20) + 50 = 4 000 + 200 + 50 = 4 250(5×800)+(10×20)+50=4000+200+50=4250 €</w:t>
+        <w:t>(5×800)+(10×20)+50=4000+200+50=4250(5 \times 800) + (10 \times 20) + 50 = 4 000 + 200 + 50 = 4 250(5×800)+(10×20)+50=4000+200+50=4250 €</w:t>
       </w:r>
     </w:p>
     <w:p>
@@ -681,7 +700,6 @@
           <w:b/>
           <w:bCs/>
         </w:rPr>
-        <w:lastRenderedPageBreak/>
         <w:t>Exercice 5 – Facture avec escompte</w:t>
       </w:r>
     </w:p>
@@ -708,6 +726,7 @@
         </w:numPr>
       </w:pPr>
       <w:r>
+        <w:lastRenderedPageBreak/>
         <w:t>5000×0.02=1005 000 \times 0.02 = 1005000×0.02=100 €</w:t>
       </w:r>
     </w:p>
@@ -734,15 +753,7 @@
         </w:numPr>
       </w:pPr>
       <w:r>
-        <w:t>(5000−</w:t>
-      </w:r>
-      <w:proofErr w:type="gramStart"/>
-      <w:r>
-        <w:t>100)×</w:t>
-      </w:r>
-      <w:proofErr w:type="gramEnd"/>
-      <w:r>
-        <w:t>0.2=980(5 000 - 100) \times 0.2 = 980(5000−100)×0.2=980 €</w:t>
+        <w:t>(5000−100)×0.2=980(5 000 - 100) \times 0.2 = 980(5000−100)×0.2=980 €</w:t>
       </w:r>
     </w:p>
     <w:p>
@@ -774,7 +785,7 @@
     <w:p>
       <w:r>
         <w:pict w14:anchorId="60A519B1">
-          <v:rect id="_x0000_i1083" style="width:0;height:1.5pt" o:hralign="center" o:hrstd="t" o:hr="t" fillcolor="#a0a0a0" stroked="f"/>
+          <v:rect id="_x0000_i1027" style="width:0;height:1.5pt" o:hralign="center" o:hrstd="t" o:hr="t" fillcolor="#a0a0a0" stroked="f"/>
         </w:pict>
       </w:r>
     </w:p>
@@ -848,7 +859,7 @@
     <w:p>
       <w:r>
         <w:pict w14:anchorId="38D796A2">
-          <v:rect id="_x0000_i1084" style="width:0;height:1.5pt" o:hralign="center" o:hrstd="t" o:hr="t" fillcolor="#a0a0a0" stroked="f"/>
+          <v:rect id="_x0000_i1028" style="width:0;height:1.5pt" o:hralign="center" o:hrstd="t" o:hr="t" fillcolor="#a0a0a0" stroked="f"/>
         </w:pict>
       </w:r>
     </w:p>
@@ -890,15 +901,7 @@
         </w:numPr>
       </w:pPr>
       <w:r>
-        <w:t>15000×20120=250015 000 \times \</w:t>
-      </w:r>
-      <w:proofErr w:type="gramStart"/>
-      <w:r>
-        <w:t>frac{</w:t>
-      </w:r>
-      <w:proofErr w:type="gramEnd"/>
-      <w:r>
-        <w:t>20}{120} = 2 50015000×12020</w:t>
+        <w:t>15000×20120=250015 000 \times \frac{20}{120} = 2 50015000×12020</w:t>
       </w:r>
       <w:r>
         <w:rPr>
@@ -939,7 +942,7 @@
     <w:p>
       <w:r>
         <w:pict w14:anchorId="41BA9DF1">
-          <v:rect id="_x0000_i1085" style="width:0;height:1.5pt" o:hralign="center" o:hrstd="t" o:hr="t" fillcolor="#a0a0a0" stroked="f"/>
+          <v:rect id="_x0000_i1029" style="width:0;height:1.5pt" o:hralign="center" o:hrstd="t" o:hr="t" fillcolor="#a0a0a0" stroked="f"/>
         </w:pict>
       </w:r>
     </w:p>
@@ -1011,7 +1014,6 @@
           <w:b/>
           <w:bCs/>
         </w:rPr>
-        <w:lastRenderedPageBreak/>
         <w:t>Exercice 8 – Facture avec rabais, remise et ristourne</w:t>
       </w:r>
     </w:p>
@@ -1038,6 +1040,7 @@
         </w:numPr>
       </w:pPr>
       <w:r>
+        <w:lastRenderedPageBreak/>
         <w:t>10000×0.05=50010 000 \times 0.05 = 50010000×0.05=500 €</w:t>
       </w:r>
     </w:p>
@@ -1064,15 +1067,7 @@
         </w:numPr>
       </w:pPr>
       <w:r>
-        <w:t>(10000−</w:t>
-      </w:r>
-      <w:proofErr w:type="gramStart"/>
-      <w:r>
-        <w:t>500)×</w:t>
-      </w:r>
-      <w:proofErr w:type="gramEnd"/>
-      <w:r>
-        <w:t>0.1=950(10 000 - 500) \times 0.1 = 950(10000−500)×0.1=950 €</w:t>
+        <w:t>(10000−500)×0.1=950(10 000 - 500) \times 0.1 = 950(10000−500)×0.1=950 €</w:t>
       </w:r>
     </w:p>
     <w:p>
@@ -1321,7 +1316,6 @@
           <w:b/>
           <w:bCs/>
         </w:rPr>
-        <w:lastRenderedPageBreak/>
         <w:t>Exercice 10 – Calcul de la TVA due à partir des montants TTC</w:t>
       </w:r>
     </w:p>
@@ -1348,6 +1342,7 @@
         </w:numPr>
       </w:pPr>
       <w:r>
+        <w:lastRenderedPageBreak/>
         <w:t xml:space="preserve">Matériel informatique : 24000/1.2=2000024 000 / 1.2 = 20 00024000/1.2=20000 € HT, TVA = </w:t>
       </w:r>
       <w:r>
@@ -1771,6 +1766,119 @@
     </w:lvl>
   </w:abstractNum>
   <w:abstractNum w:abstractNumId="2" w15:restartNumberingAfterBreak="0">
+    <w:nsid w:val="112B581D"/>
+    <w:multiLevelType w:val="multilevel"/>
+    <w:tmpl w:val="20F22546"/>
+    <w:lvl w:ilvl="0">
+      <w:start w:val="2"/>
+      <w:numFmt w:val="decimal"/>
+      <w:lvlText w:val="%1."/>
+      <w:lvlJc w:val="left"/>
+      <w:pPr>
+        <w:tabs>
+          <w:tab w:val="num" w:pos="720"/>
+        </w:tabs>
+        <w:ind w:left="720" w:hanging="360"/>
+      </w:pPr>
+    </w:lvl>
+    <w:lvl w:ilvl="1" w:tentative="1">
+      <w:start w:val="1"/>
+      <w:numFmt w:val="decimal"/>
+      <w:lvlText w:val="%2."/>
+      <w:lvlJc w:val="left"/>
+      <w:pPr>
+        <w:tabs>
+          <w:tab w:val="num" w:pos="1440"/>
+        </w:tabs>
+        <w:ind w:left="1440" w:hanging="360"/>
+      </w:pPr>
+    </w:lvl>
+    <w:lvl w:ilvl="2" w:tentative="1">
+      <w:start w:val="1"/>
+      <w:numFmt w:val="decimal"/>
+      <w:lvlText w:val="%3."/>
+      <w:lvlJc w:val="left"/>
+      <w:pPr>
+        <w:tabs>
+          <w:tab w:val="num" w:pos="2160"/>
+        </w:tabs>
+        <w:ind w:left="2160" w:hanging="360"/>
+      </w:pPr>
+    </w:lvl>
+    <w:lvl w:ilvl="3" w:tentative="1">
+      <w:start w:val="1"/>
+      <w:numFmt w:val="decimal"/>
+      <w:lvlText w:val="%4."/>
+      <w:lvlJc w:val="left"/>
+      <w:pPr>
+        <w:tabs>
+          <w:tab w:val="num" w:pos="2880"/>
+        </w:tabs>
+        <w:ind w:left="2880" w:hanging="360"/>
+      </w:pPr>
+    </w:lvl>
+    <w:lvl w:ilvl="4" w:tentative="1">
+      <w:start w:val="1"/>
+      <w:numFmt w:val="decimal"/>
+      <w:lvlText w:val="%5."/>
+      <w:lvlJc w:val="left"/>
+      <w:pPr>
+        <w:tabs>
+          <w:tab w:val="num" w:pos="3600"/>
+        </w:tabs>
+        <w:ind w:left="3600" w:hanging="360"/>
+      </w:pPr>
+    </w:lvl>
+    <w:lvl w:ilvl="5" w:tentative="1">
+      <w:start w:val="1"/>
+      <w:numFmt w:val="decimal"/>
+      <w:lvlText w:val="%6."/>
+      <w:lvlJc w:val="left"/>
+      <w:pPr>
+        <w:tabs>
+          <w:tab w:val="num" w:pos="4320"/>
+        </w:tabs>
+        <w:ind w:left="4320" w:hanging="360"/>
+      </w:pPr>
+    </w:lvl>
+    <w:lvl w:ilvl="6" w:tentative="1">
+      <w:start w:val="1"/>
+      <w:numFmt w:val="decimal"/>
+      <w:lvlText w:val="%7."/>
+      <w:lvlJc w:val="left"/>
+      <w:pPr>
+        <w:tabs>
+          <w:tab w:val="num" w:pos="5040"/>
+        </w:tabs>
+        <w:ind w:left="5040" w:hanging="360"/>
+      </w:pPr>
+    </w:lvl>
+    <w:lvl w:ilvl="7" w:tentative="1">
+      <w:start w:val="1"/>
+      <w:numFmt w:val="decimal"/>
+      <w:lvlText w:val="%8."/>
+      <w:lvlJc w:val="left"/>
+      <w:pPr>
+        <w:tabs>
+          <w:tab w:val="num" w:pos="5760"/>
+        </w:tabs>
+        <w:ind w:left="5760" w:hanging="360"/>
+      </w:pPr>
+    </w:lvl>
+    <w:lvl w:ilvl="8" w:tentative="1">
+      <w:start w:val="1"/>
+      <w:numFmt w:val="decimal"/>
+      <w:lvlText w:val="%9."/>
+      <w:lvlJc w:val="left"/>
+      <w:pPr>
+        <w:tabs>
+          <w:tab w:val="num" w:pos="6480"/>
+        </w:tabs>
+        <w:ind w:left="6480" w:hanging="360"/>
+      </w:pPr>
+    </w:lvl>
+  </w:abstractNum>
+  <w:abstractNum w:abstractNumId="3" w15:restartNumberingAfterBreak="0">
     <w:nsid w:val="174271E1"/>
     <w:multiLevelType w:val="multilevel"/>
     <w:tmpl w:val="0B6EF294"/>
@@ -1887,7 +1995,7 @@
       </w:pPr>
     </w:lvl>
   </w:abstractNum>
-  <w:abstractNum w:abstractNumId="3" w15:restartNumberingAfterBreak="0">
+  <w:abstractNum w:abstractNumId="4" w15:restartNumberingAfterBreak="0">
     <w:nsid w:val="1F216232"/>
     <w:multiLevelType w:val="multilevel"/>
     <w:tmpl w:val="E5C2CBD6"/>
@@ -2004,7 +2112,7 @@
       </w:pPr>
     </w:lvl>
   </w:abstractNum>
-  <w:abstractNum w:abstractNumId="4" w15:restartNumberingAfterBreak="0">
+  <w:abstractNum w:abstractNumId="5" w15:restartNumberingAfterBreak="0">
     <w:nsid w:val="33173397"/>
     <w:multiLevelType w:val="multilevel"/>
     <w:tmpl w:val="CC34A5D4"/>
@@ -2121,7 +2229,7 @@
       </w:pPr>
     </w:lvl>
   </w:abstractNum>
-  <w:abstractNum w:abstractNumId="5" w15:restartNumberingAfterBreak="0">
+  <w:abstractNum w:abstractNumId="6" w15:restartNumberingAfterBreak="0">
     <w:nsid w:val="4DB30A56"/>
     <w:multiLevelType w:val="multilevel"/>
     <w:tmpl w:val="8D1CF268"/>
@@ -2238,7 +2346,7 @@
       </w:pPr>
     </w:lvl>
   </w:abstractNum>
-  <w:abstractNum w:abstractNumId="6" w15:restartNumberingAfterBreak="0">
+  <w:abstractNum w:abstractNumId="7" w15:restartNumberingAfterBreak="0">
     <w:nsid w:val="52111E8C"/>
     <w:multiLevelType w:val="multilevel"/>
     <w:tmpl w:val="366AD9AC"/>
@@ -2355,7 +2463,7 @@
       </w:pPr>
     </w:lvl>
   </w:abstractNum>
-  <w:abstractNum w:abstractNumId="7" w15:restartNumberingAfterBreak="0">
+  <w:abstractNum w:abstractNumId="8" w15:restartNumberingAfterBreak="0">
     <w:nsid w:val="5A9B4252"/>
     <w:multiLevelType w:val="multilevel"/>
     <w:tmpl w:val="F06625F4"/>
@@ -2472,7 +2580,120 @@
       </w:pPr>
     </w:lvl>
   </w:abstractNum>
-  <w:abstractNum w:abstractNumId="8" w15:restartNumberingAfterBreak="0">
+  <w:abstractNum w:abstractNumId="9" w15:restartNumberingAfterBreak="0">
+    <w:nsid w:val="5CA03B4C"/>
+    <w:multiLevelType w:val="multilevel"/>
+    <w:tmpl w:val="04F46826"/>
+    <w:lvl w:ilvl="0">
+      <w:start w:val="1"/>
+      <w:numFmt w:val="decimal"/>
+      <w:lvlText w:val="%1."/>
+      <w:lvlJc w:val="left"/>
+      <w:pPr>
+        <w:tabs>
+          <w:tab w:val="num" w:pos="720"/>
+        </w:tabs>
+        <w:ind w:left="720" w:hanging="360"/>
+      </w:pPr>
+    </w:lvl>
+    <w:lvl w:ilvl="1" w:tentative="1">
+      <w:start w:val="1"/>
+      <w:numFmt w:val="decimal"/>
+      <w:lvlText w:val="%2."/>
+      <w:lvlJc w:val="left"/>
+      <w:pPr>
+        <w:tabs>
+          <w:tab w:val="num" w:pos="1440"/>
+        </w:tabs>
+        <w:ind w:left="1440" w:hanging="360"/>
+      </w:pPr>
+    </w:lvl>
+    <w:lvl w:ilvl="2" w:tentative="1">
+      <w:start w:val="1"/>
+      <w:numFmt w:val="decimal"/>
+      <w:lvlText w:val="%3."/>
+      <w:lvlJc w:val="left"/>
+      <w:pPr>
+        <w:tabs>
+          <w:tab w:val="num" w:pos="2160"/>
+        </w:tabs>
+        <w:ind w:left="2160" w:hanging="360"/>
+      </w:pPr>
+    </w:lvl>
+    <w:lvl w:ilvl="3" w:tentative="1">
+      <w:start w:val="1"/>
+      <w:numFmt w:val="decimal"/>
+      <w:lvlText w:val="%4."/>
+      <w:lvlJc w:val="left"/>
+      <w:pPr>
+        <w:tabs>
+          <w:tab w:val="num" w:pos="2880"/>
+        </w:tabs>
+        <w:ind w:left="2880" w:hanging="360"/>
+      </w:pPr>
+    </w:lvl>
+    <w:lvl w:ilvl="4" w:tentative="1">
+      <w:start w:val="1"/>
+      <w:numFmt w:val="decimal"/>
+      <w:lvlText w:val="%5."/>
+      <w:lvlJc w:val="left"/>
+      <w:pPr>
+        <w:tabs>
+          <w:tab w:val="num" w:pos="3600"/>
+        </w:tabs>
+        <w:ind w:left="3600" w:hanging="360"/>
+      </w:pPr>
+    </w:lvl>
+    <w:lvl w:ilvl="5" w:tentative="1">
+      <w:start w:val="1"/>
+      <w:numFmt w:val="decimal"/>
+      <w:lvlText w:val="%6."/>
+      <w:lvlJc w:val="left"/>
+      <w:pPr>
+        <w:tabs>
+          <w:tab w:val="num" w:pos="4320"/>
+        </w:tabs>
+        <w:ind w:left="4320" w:hanging="360"/>
+      </w:pPr>
+    </w:lvl>
+    <w:lvl w:ilvl="6" w:tentative="1">
+      <w:start w:val="1"/>
+      <w:numFmt w:val="decimal"/>
+      <w:lvlText w:val="%7."/>
+      <w:lvlJc w:val="left"/>
+      <w:pPr>
+        <w:tabs>
+          <w:tab w:val="num" w:pos="5040"/>
+        </w:tabs>
+        <w:ind w:left="5040" w:hanging="360"/>
+      </w:pPr>
+    </w:lvl>
+    <w:lvl w:ilvl="7" w:tentative="1">
+      <w:start w:val="1"/>
+      <w:numFmt w:val="decimal"/>
+      <w:lvlText w:val="%8."/>
+      <w:lvlJc w:val="left"/>
+      <w:pPr>
+        <w:tabs>
+          <w:tab w:val="num" w:pos="5760"/>
+        </w:tabs>
+        <w:ind w:left="5760" w:hanging="360"/>
+      </w:pPr>
+    </w:lvl>
+    <w:lvl w:ilvl="8" w:tentative="1">
+      <w:start w:val="1"/>
+      <w:numFmt w:val="decimal"/>
+      <w:lvlText w:val="%9."/>
+      <w:lvlJc w:val="left"/>
+      <w:pPr>
+        <w:tabs>
+          <w:tab w:val="num" w:pos="6480"/>
+        </w:tabs>
+        <w:ind w:left="6480" w:hanging="360"/>
+      </w:pPr>
+    </w:lvl>
+  </w:abstractNum>
+  <w:abstractNum w:abstractNumId="10" w15:restartNumberingAfterBreak="0">
     <w:nsid w:val="62AC2745"/>
     <w:multiLevelType w:val="multilevel"/>
     <w:tmpl w:val="7C3C7094"/>
@@ -2589,7 +2810,7 @@
       </w:pPr>
     </w:lvl>
   </w:abstractNum>
-  <w:abstractNum w:abstractNumId="9" w15:restartNumberingAfterBreak="0">
+  <w:abstractNum w:abstractNumId="11" w15:restartNumberingAfterBreak="0">
     <w:nsid w:val="62E11C23"/>
     <w:multiLevelType w:val="multilevel"/>
     <w:tmpl w:val="354AE4FE"/>
@@ -2706,35 +2927,157 @@
       </w:pPr>
     </w:lvl>
   </w:abstractNum>
+  <w:abstractNum w:abstractNumId="12" w15:restartNumberingAfterBreak="0">
+    <w:nsid w:val="6ECC5B97"/>
+    <w:multiLevelType w:val="multilevel"/>
+    <w:tmpl w:val="0A12A8EC"/>
+    <w:lvl w:ilvl="0">
+      <w:start w:val="3"/>
+      <w:numFmt w:val="decimal"/>
+      <w:lvlText w:val="%1."/>
+      <w:lvlJc w:val="left"/>
+      <w:pPr>
+        <w:tabs>
+          <w:tab w:val="num" w:pos="720"/>
+        </w:tabs>
+        <w:ind w:left="720" w:hanging="360"/>
+      </w:pPr>
+    </w:lvl>
+    <w:lvl w:ilvl="1" w:tentative="1">
+      <w:start w:val="1"/>
+      <w:numFmt w:val="decimal"/>
+      <w:lvlText w:val="%2."/>
+      <w:lvlJc w:val="left"/>
+      <w:pPr>
+        <w:tabs>
+          <w:tab w:val="num" w:pos="1440"/>
+        </w:tabs>
+        <w:ind w:left="1440" w:hanging="360"/>
+      </w:pPr>
+    </w:lvl>
+    <w:lvl w:ilvl="2" w:tentative="1">
+      <w:start w:val="1"/>
+      <w:numFmt w:val="decimal"/>
+      <w:lvlText w:val="%3."/>
+      <w:lvlJc w:val="left"/>
+      <w:pPr>
+        <w:tabs>
+          <w:tab w:val="num" w:pos="2160"/>
+        </w:tabs>
+        <w:ind w:left="2160" w:hanging="360"/>
+      </w:pPr>
+    </w:lvl>
+    <w:lvl w:ilvl="3" w:tentative="1">
+      <w:start w:val="1"/>
+      <w:numFmt w:val="decimal"/>
+      <w:lvlText w:val="%4."/>
+      <w:lvlJc w:val="left"/>
+      <w:pPr>
+        <w:tabs>
+          <w:tab w:val="num" w:pos="2880"/>
+        </w:tabs>
+        <w:ind w:left="2880" w:hanging="360"/>
+      </w:pPr>
+    </w:lvl>
+    <w:lvl w:ilvl="4" w:tentative="1">
+      <w:start w:val="1"/>
+      <w:numFmt w:val="decimal"/>
+      <w:lvlText w:val="%5."/>
+      <w:lvlJc w:val="left"/>
+      <w:pPr>
+        <w:tabs>
+          <w:tab w:val="num" w:pos="3600"/>
+        </w:tabs>
+        <w:ind w:left="3600" w:hanging="360"/>
+      </w:pPr>
+    </w:lvl>
+    <w:lvl w:ilvl="5" w:tentative="1">
+      <w:start w:val="1"/>
+      <w:numFmt w:val="decimal"/>
+      <w:lvlText w:val="%6."/>
+      <w:lvlJc w:val="left"/>
+      <w:pPr>
+        <w:tabs>
+          <w:tab w:val="num" w:pos="4320"/>
+        </w:tabs>
+        <w:ind w:left="4320" w:hanging="360"/>
+      </w:pPr>
+    </w:lvl>
+    <w:lvl w:ilvl="6" w:tentative="1">
+      <w:start w:val="1"/>
+      <w:numFmt w:val="decimal"/>
+      <w:lvlText w:val="%7."/>
+      <w:lvlJc w:val="left"/>
+      <w:pPr>
+        <w:tabs>
+          <w:tab w:val="num" w:pos="5040"/>
+        </w:tabs>
+        <w:ind w:left="5040" w:hanging="360"/>
+      </w:pPr>
+    </w:lvl>
+    <w:lvl w:ilvl="7" w:tentative="1">
+      <w:start w:val="1"/>
+      <w:numFmt w:val="decimal"/>
+      <w:lvlText w:val="%8."/>
+      <w:lvlJc w:val="left"/>
+      <w:pPr>
+        <w:tabs>
+          <w:tab w:val="num" w:pos="5760"/>
+        </w:tabs>
+        <w:ind w:left="5760" w:hanging="360"/>
+      </w:pPr>
+    </w:lvl>
+    <w:lvl w:ilvl="8" w:tentative="1">
+      <w:start w:val="1"/>
+      <w:numFmt w:val="decimal"/>
+      <w:lvlText w:val="%9."/>
+      <w:lvlJc w:val="left"/>
+      <w:pPr>
+        <w:tabs>
+          <w:tab w:val="num" w:pos="6480"/>
+        </w:tabs>
+        <w:ind w:left="6480" w:hanging="360"/>
+      </w:pPr>
+    </w:lvl>
+  </w:abstractNum>
   <w:num w:numId="1" w16cid:durableId="270014957">
-    <w:abstractNumId w:val="6"/>
+    <w:abstractNumId w:val="7"/>
   </w:num>
   <w:num w:numId="2" w16cid:durableId="888344496">
-    <w:abstractNumId w:val="7"/>
+    <w:abstractNumId w:val="8"/>
   </w:num>
   <w:num w:numId="3" w16cid:durableId="33046529">
     <w:abstractNumId w:val="0"/>
   </w:num>
   <w:num w:numId="4" w16cid:durableId="1586767104">
-    <w:abstractNumId w:val="2"/>
+    <w:abstractNumId w:val="3"/>
   </w:num>
   <w:num w:numId="5" w16cid:durableId="614557467">
-    <w:abstractNumId w:val="3"/>
+    <w:abstractNumId w:val="4"/>
   </w:num>
   <w:num w:numId="6" w16cid:durableId="358894677">
-    <w:abstractNumId w:val="4"/>
+    <w:abstractNumId w:val="5"/>
   </w:num>
   <w:num w:numId="7" w16cid:durableId="1145009125">
     <w:abstractNumId w:val="1"/>
   </w:num>
   <w:num w:numId="8" w16cid:durableId="607011816">
-    <w:abstractNumId w:val="8"/>
+    <w:abstractNumId w:val="10"/>
   </w:num>
   <w:num w:numId="9" w16cid:durableId="207497010">
-    <w:abstractNumId w:val="5"/>
+    <w:abstractNumId w:val="6"/>
   </w:num>
   <w:num w:numId="10" w16cid:durableId="919800501">
+    <w:abstractNumId w:val="11"/>
+  </w:num>
+  <w:num w:numId="11" w16cid:durableId="220944443">
     <w:abstractNumId w:val="9"/>
+  </w:num>
+  <w:num w:numId="12" w16cid:durableId="812137611">
+    <w:abstractNumId w:val="2"/>
+  </w:num>
+  <w:num w:numId="13" w16cid:durableId="57678896">
+    <w:abstractNumId w:val="12"/>
   </w:num>
 </w:numbering>
 </file>

</xml_diff>